<commit_message>
docs: refresh policy governance submission
</commit_message>
<xml_diff>
--- a/docs/competition/MoonTrustFlow项目申报书.docx
+++ b/docs/competition/MoonTrustFlow项目申报书.docx
@@ -4,10 +4,13 @@
   <w:body>
     <w:p>
       <w:pPr>
-        <w:pStyle w:val="Title"/>
         <w:jc w:val="center"/>
       </w:pPr>
       <w:r>
+        <w:rPr>
+          <w:b/>
+          <w:sz w:val="36"/>
+        </w:rPr>
         <w:t>MoonTrustFlow 项目申报书</w:t>
       </w:r>
     </w:p>
@@ -18,27 +21,27 @@
         <w:tblLook w:firstColumn="1" w:firstRow="1" w:lastColumn="0" w:lastRow="0" w:noHBand="0" w:noVBand="1" w:val="04A0"/>
       </w:tblPr>
       <w:tblGrid>
-        <w:gridCol w:w="4320"/>
-        <w:gridCol w:w="4320"/>
+        <w:gridCol w:w="5040"/>
+        <w:gridCol w:w="5040"/>
       </w:tblGrid>
       <w:tr>
         <w:tc>
           <w:tcPr>
-            <w:tcW w:type="dxa" w:w="4320"/>
+            <w:tcW w:type="dxa" w:w="5040"/>
           </w:tcPr>
           <w:p>
             <w:r>
-              <w:t>项目名称</w:t>
+              <w:t>项目</w:t>
             </w:r>
           </w:p>
         </w:tc>
         <w:tc>
           <w:tcPr>
-            <w:tcW w:type="dxa" w:w="4320"/>
+            <w:tcW w:type="dxa" w:w="5040"/>
           </w:tcPr>
           <w:p>
             <w:r>
-              <w:t>MoonTrustFlow：MoonBit 轻量级数据流安全分析与污染传播检测框架</w:t>
+              <w:t>MoonTrustFlow：MoonBit Policy-as-Code 与可信数据流治理工具包</w:t>
             </w:r>
           </w:p>
         </w:tc>
@@ -46,21 +49,21 @@
       <w:tr>
         <w:tc>
           <w:tcPr>
-            <w:tcW w:type="dxa" w:w="4320"/>
+            <w:tcW w:type="dxa" w:w="5040"/>
           </w:tcPr>
           <w:p>
             <w:r>
-              <w:t>参赛方向</w:t>
+              <w:t>方向</w:t>
             </w:r>
           </w:p>
         </w:tc>
         <w:tc>
           <w:tcPr>
-            <w:tcW w:type="dxa" w:w="4320"/>
+            <w:tcW w:type="dxa" w:w="5040"/>
           </w:tcPr>
           <w:p>
             <w:r>
-              <w:t>MoonBit 国产基础软件开源生态项目</w:t>
+              <w:t>Policy-as-Code / 可信数据流治理 / 工程工具</w:t>
             </w:r>
           </w:p>
         </w:tc>
@@ -68,17 +71,17 @@
       <w:tr>
         <w:tc>
           <w:tcPr>
-            <w:tcW w:type="dxa" w:w="4320"/>
+            <w:tcW w:type="dxa" w:w="5040"/>
           </w:tcPr>
           <w:p>
             <w:r>
-              <w:t>开源许可证</w:t>
+              <w:t>许可证</w:t>
             </w:r>
           </w:p>
         </w:tc>
         <w:tc>
           <w:tcPr>
-            <w:tcW w:type="dxa" w:w="4320"/>
+            <w:tcW w:type="dxa" w:w="5040"/>
           </w:tcPr>
           <w:p>
             <w:r>
@@ -90,107 +93,152 @@
       <w:tr>
         <w:tc>
           <w:tcPr>
-            <w:tcW w:type="dxa" w:w="4320"/>
+            <w:tcW w:type="dxa" w:w="5040"/>
           </w:tcPr>
           <w:p>
             <w:r>
-              <w:t>仓库链接</w:t>
+              <w:t>仓库</w:t>
             </w:r>
           </w:p>
         </w:tc>
         <w:tc>
           <w:tcPr>
-            <w:tcW w:type="dxa" w:w="4320"/>
+            <w:tcW w:type="dxa" w:w="5040"/>
           </w:tcPr>
           <w:p>
             <w:r>
-              <w:t>https://gitlink.org.cn/python123/moontrustflow</w:t>
+              <w:t>GitHub：https://github.com/lllg123/MoonTrustFlow-MoonBit-</w:t>
+              <w:br/>
+              <w:t>GitLink：https://www.gitlink.org.cn/lllglllg/MoonTrustFlow</w:t>
             </w:r>
           </w:p>
         </w:tc>
       </w:tr>
     </w:tbl>
     <w:p>
+      <w:r>
+        <w:rPr>
+          <w:b/>
+          <w:sz w:val="22"/>
+        </w:rPr>
+        <w:t>1. 项目名称</w:t>
+      </w:r>
+    </w:p>
+    <w:p>
       <w:pPr>
-        <w:pStyle w:val="Heading1"/>
+        <w:spacing w:after="40"/>
       </w:pPr>
       <w:r>
-        <w:t>一、项目简介</w:t>
+        <w:t>MoonTrustFlow：MoonBit Policy-as-Code 与可信数据流治理工具包</w:t>
       </w:r>
     </w:p>
     <w:p>
       <w:r>
-        <w:t>MoonTrustFlow 是一个面向 MoonBit 生态的软件分析基础库。项目通过小型 .mtf 规则语言描述敏感源、危险汇点、净化器、数据流边和允许路径，并在 MoonBit 中实现污染传播分析，输出可解释的 source-to-sink 风险路径。</w:t>
+        <w:rPr>
+          <w:b/>
+          <w:sz w:val="22"/>
+        </w:rPr>
+        <w:t>2. 项目简介</w:t>
       </w:r>
     </w:p>
     <w:p>
       <w:pPr>
-        <w:pStyle w:val="Heading1"/>
+        <w:spacing w:after="40"/>
       </w:pPr>
       <w:r>
-        <w:t>二、项目方向与适用场景</w:t>
+        <w:t>MoonTrustFlow 是面向 MoonBit 生态的轻量策略评估工具包。项目使用 .mtf 规则描述数据源、危险汇点、可信边界、净化控制点、数据流边、禁止路径、必经控制点和例外策略，并输出可解释的合规/风险报告。</w:t>
       </w:r>
     </w:p>
     <w:p>
       <w:r>
-        <w:t>项目贴合软件分析框架、工程工具和基础软件生态补位方向。适用场景包括服务端输入到危险操作的数据流建模、AI 生成代码安全审查、CI 架构安全约束检查、可信工具链实验以及后续 MoonBit AST 分析器建设。</w:t>
+        <w:rPr>
+          <w:b/>
+          <w:sz w:val="22"/>
+        </w:rPr>
+        <w:t>3. 项目方向与适用场景</w:t>
       </w:r>
     </w:p>
     <w:p>
       <w:pPr>
-        <w:pStyle w:val="Heading1"/>
+        <w:spacing w:after="40"/>
       </w:pPr>
       <w:r>
-        <w:t>三、核心功能</w:t>
+        <w:t>方向为工程工具、策略评估和基础软件生态补位。适用于服务边界治理、CI 审计、架构评审、数据流控制点检查，以及后续接入 MoonBit AST 或调用图的工具链。</w:t>
       </w:r>
     </w:p>
     <w:p>
       <w:r>
-        <w:t>项目支持 source、sink、sanitizer、node、edge、allow 等声明，能够构建有向数据流图，从 source 出发传播污染标记，在 sanitizer 处截断传播，在 sink 处生成完整风险路径，并用 allow 规则压制已知安全链路。</w:t>
+        <w:rPr>
+          <w:b/>
+          <w:sz w:val="22"/>
+        </w:rPr>
+        <w:t>4. 拟实现的核心功能</w:t>
       </w:r>
     </w:p>
     <w:p>
       <w:pPr>
-        <w:pStyle w:val="Heading1"/>
+        <w:spacing w:after="40"/>
       </w:pPr>
       <w:r>
-        <w:t>四、原创性说明</w:t>
+        <w:t>解析 .mtf 模型；支持 source/sink/sanitizer/boundary/node/edge；支持 deny、require through=、allow；支持 severity 风险等级；按图路径评估策略并生成稳定报告。</w:t>
       </w:r>
     </w:p>
     <w:p>
       <w:r>
-        <w:t>本项目为原创项目，不移植已有开源项目。项目选择规则模型与污染传播分析作为切入点，避开常见格式解析器、日志处理库和发布工具等容易重合的方向。核心规则语言、数据结构、分析算法、诊断信息和报告格式均围绕 MoonBit 生态重新设计。</w:t>
+        <w:rPr>
+          <w:b/>
+          <w:sz w:val="22"/>
+        </w:rPr>
+        <w:t>5. 原创性说明</w:t>
       </w:r>
     </w:p>
     <w:p>
       <w:pPr>
-        <w:pStyle w:val="Heading1"/>
+        <w:spacing w:after="40"/>
       </w:pPr>
       <w:r>
-        <w:t>五、技术路线</w:t>
+        <w:t>本项目为原创项目，不移植已有开源项目。选题避开通用数据流分析框架、依赖风险扫描和 CI 工作流检查，聚焦策略规则、可信流模型与合规报告的组合。</w:t>
       </w:r>
     </w:p>
     <w:p>
       <w:r>
-        <w:t>首版采用行级 .mtf 解析器，将每一行转换为节点、边或策略。分析阶段使用图遍历从敏感源出发记录访问路径；当路径到达危险汇点时生成 finding；当路径到达净化器时停止当前分支；当路径被 allow 规则精确匹配时不报告。</w:t>
+        <w:rPr>
+          <w:b/>
+          <w:sz w:val="22"/>
+        </w:rPr>
+        <w:t>6. 仓库链接</w:t>
       </w:r>
     </w:p>
     <w:p>
       <w:pPr>
-        <w:pStyle w:val="Heading1"/>
+        <w:spacing w:after="40"/>
       </w:pPr>
       <w:r>
-        <w:t>六、预期成果</w:t>
+        <w:t>GitHub：https://github.com/lllg123/MoonTrustFlow-MoonBit-</w:t>
+        <w:br/>
+        <w:t>GitLink：https://www.gitlink.org.cn/lllglllg/MoonTrustFlow</w:t>
       </w:r>
     </w:p>
     <w:p>
       <w:r>
-        <w:t>项目交付一个可运行、可测试、可复现的 MoonBit 软件分析基础库，包含核心库、CLI 演示、测试集、README、CI、设计文档和申报材料。后续可扩展真实文件读取、风险等级配置、MoonBit AST 适配和 HTML/JSON 报告。</w:t>
+        <w:rPr>
+          <w:b/>
+          <w:sz w:val="22"/>
+        </w:rPr>
+        <w:t>7. 提交说明</w:t>
+      </w:r>
+    </w:p>
+    <w:p>
+      <w:pPr>
+        <w:spacing w:after="40"/>
+      </w:pPr>
+      <w:r>
+        <w:t>仓库保留 10-20 次有效提交，提交内容覆盖项目骨架、领域模型、解析器、策略评估、CLI、测试、CI 和申报文档，不使用空提交或重复提交凑数。</w:t>
       </w:r>
     </w:p>
     <w:sectPr>
       <w:pgSz w:w="12240" w:h="15840"/>
-      <w:pgMar w:top="1440" w:right="1800" w:bottom="1440" w:left="1800" w:header="720" w:footer="720" w:gutter="0"/>
+      <w:pgMar w:top="840" w:right="1080" w:bottom="840" w:left="1080" w:header="720" w:footer="720" w:gutter="0"/>
       <w:cols w:space="720"/>
       <w:docGrid w:linePitch="360"/>
     </w:sectPr>
@@ -563,7 +611,7 @@
     <w:rsid w:val="00FC693F"/>
     <w:rPr>
       <w:rFonts w:ascii="Microsoft YaHei" w:hAnsi="Microsoft YaHei"/>
-      <w:sz w:val="21"/>
+      <w:sz w:val="20"/>
     </w:rPr>
   </w:style>
   <w:style w:type="paragraph" w:styleId="Header">

</xml_diff>